<commit_message>
Update project_notes.docx with approx. time taken
</commit_message>
<xml_diff>
--- a/project_notes.docx
+++ b/project_notes.docx
@@ -66,20 +66,35 @@
         <w:t>,</w:t>
       </w:r>
       <w:r>
-        <w:t xml:space="preserve"> earn_events</w:t>
-      </w:r>
+        <w:t xml:space="preserve"> </w:t>
+      </w:r>
+      <w:proofErr w:type="spellStart"/>
+      <w:r>
+        <w:t>earn_events</w:t>
+      </w:r>
+      <w:proofErr w:type="spellEnd"/>
       <w:r>
         <w:t>,</w:t>
       </w:r>
       <w:r>
-        <w:t xml:space="preserve"> redeem_events</w:t>
-      </w:r>
+        <w:t xml:space="preserve"> </w:t>
+      </w:r>
+      <w:proofErr w:type="spellStart"/>
+      <w:r>
+        <w:t>redeem_events</w:t>
+      </w:r>
+      <w:proofErr w:type="spellEnd"/>
       <w:r>
         <w:t>,</w:t>
       </w:r>
       <w:r>
-        <w:t xml:space="preserve"> fx_rates</w:t>
-      </w:r>
+        <w:t xml:space="preserve"> </w:t>
+      </w:r>
+      <w:proofErr w:type="spellStart"/>
+      <w:r>
+        <w:t>fx_rates</w:t>
+      </w:r>
+      <w:proofErr w:type="spellEnd"/>
     </w:p>
     <w:p>
       <w:r>
@@ -101,39 +116,66 @@
       </w:r>
     </w:p>
     <w:p>
+      <w:proofErr w:type="spellStart"/>
       <w:r>
         <w:t>stg_games</w:t>
       </w:r>
+      <w:proofErr w:type="spellEnd"/>
       <w:r>
         <w:t>,</w:t>
       </w:r>
       <w:r>
-        <w:t xml:space="preserve"> stg_players</w:t>
-      </w:r>
+        <w:t xml:space="preserve"> </w:t>
+      </w:r>
+      <w:proofErr w:type="spellStart"/>
+      <w:r>
+        <w:t>stg_players</w:t>
+      </w:r>
+      <w:proofErr w:type="spellEnd"/>
       <w:r>
         <w:t>,</w:t>
       </w:r>
       <w:r>
-        <w:t xml:space="preserve"> stg_earn_events</w:t>
-      </w:r>
+        <w:t xml:space="preserve"> </w:t>
+      </w:r>
+      <w:proofErr w:type="spellStart"/>
+      <w:r>
+        <w:t>stg_earn_events</w:t>
+      </w:r>
+      <w:proofErr w:type="spellEnd"/>
       <w:r>
         <w:t>,</w:t>
       </w:r>
       <w:r>
-        <w:t xml:space="preserve"> stg_redeem_events</w:t>
-      </w:r>
+        <w:t xml:space="preserve"> </w:t>
+      </w:r>
+      <w:proofErr w:type="spellStart"/>
+      <w:r>
+        <w:t>stg_redeem_events</w:t>
+      </w:r>
+      <w:proofErr w:type="spellEnd"/>
       <w:r>
         <w:t>,</w:t>
       </w:r>
       <w:r>
-        <w:t xml:space="preserve"> stg_redemption_history</w:t>
-      </w:r>
+        <w:t xml:space="preserve"> </w:t>
+      </w:r>
+      <w:proofErr w:type="spellStart"/>
+      <w:r>
+        <w:t>stg_redemption_history</w:t>
+      </w:r>
+      <w:proofErr w:type="spellEnd"/>
       <w:r>
         <w:t>,</w:t>
       </w:r>
       <w:r>
-        <w:t xml:space="preserve"> stg_fx_rates</w:t>
-      </w:r>
+        <w:t xml:space="preserve"> </w:t>
+      </w:r>
+      <w:proofErr w:type="spellStart"/>
+      <w:r>
+        <w:t>stg_fx_rates</w:t>
+      </w:r>
+      <w:proofErr w:type="spellEnd"/>
     </w:p>
     <w:p>
       <w:pPr>
@@ -167,27 +209,44 @@
       </w:r>
     </w:p>
     <w:p>
+      <w:proofErr w:type="spellStart"/>
       <w:r>
         <w:t>monthly_earned</w:t>
       </w:r>
+      <w:proofErr w:type="spellEnd"/>
       <w:r>
         <w:t>,</w:t>
       </w:r>
       <w:r>
-        <w:t xml:space="preserve"> monthly_redeemed</w:t>
-      </w:r>
+        <w:t xml:space="preserve"> </w:t>
+      </w:r>
+      <w:proofErr w:type="spellStart"/>
+      <w:r>
+        <w:t>monthly_redeemed</w:t>
+      </w:r>
+      <w:proofErr w:type="spellEnd"/>
       <w:r>
         <w:t>,</w:t>
       </w:r>
       <w:r>
-        <w:t xml:space="preserve"> monthly_redeemed_by_game</w:t>
-      </w:r>
+        <w:t xml:space="preserve"> </w:t>
+      </w:r>
+      <w:proofErr w:type="spellStart"/>
+      <w:r>
+        <w:t>monthly_redeemed_by_game</w:t>
+      </w:r>
+      <w:proofErr w:type="spellEnd"/>
       <w:r>
         <w:t>,</w:t>
       </w:r>
       <w:r>
-        <w:t xml:space="preserve"> monthly_outstanding_float</w:t>
-      </w:r>
+        <w:t xml:space="preserve"> </w:t>
+      </w:r>
+      <w:proofErr w:type="spellStart"/>
+      <w:r>
+        <w:t>monthly_outstanding_float</w:t>
+      </w:r>
+      <w:proofErr w:type="spellEnd"/>
     </w:p>
     <w:p/>
     <w:p>
@@ -273,8 +332,13 @@
     </w:p>
     <w:p>
       <w:r>
-        <w:t>All dates are in the same timezone</w:t>
-      </w:r>
+        <w:t xml:space="preserve">All dates are in the same </w:t>
+      </w:r>
+      <w:proofErr w:type="spellStart"/>
+      <w:r>
+        <w:t>timezone</w:t>
+      </w:r>
+      <w:proofErr w:type="spellEnd"/>
       <w:r>
         <w:t>.</w:t>
       </w:r>
@@ -298,7 +362,15 @@
         <w:t>that share</w:t>
       </w:r>
       <w:r>
-        <w:t xml:space="preserve"> the same earn_id are treated as duplicate records and counted once</w:t>
+        <w:t xml:space="preserve"> the same </w:t>
+      </w:r>
+      <w:proofErr w:type="spellStart"/>
+      <w:r>
+        <w:t>earn_id</w:t>
+      </w:r>
+      <w:proofErr w:type="spellEnd"/>
+      <w:r>
+        <w:t xml:space="preserve"> are treated as duplicate records and counted once</w:t>
       </w:r>
       <w:r>
         <w:t>.</w:t>
@@ -309,11 +381,24 @@
         <w:t>Redeem events table does not</w:t>
       </w:r>
       <w:r>
-        <w:t xml:space="preserve"> include a game_id so</w:t>
-      </w:r>
-      <w:r>
-        <w:t xml:space="preserve"> using primary_game_id</w:t>
-      </w:r>
+        <w:t xml:space="preserve"> include a </w:t>
+      </w:r>
+      <w:proofErr w:type="spellStart"/>
+      <w:r>
+        <w:t>game_id</w:t>
+      </w:r>
+      <w:proofErr w:type="spellEnd"/>
+      <w:r>
+        <w:t xml:space="preserve"> so</w:t>
+      </w:r>
+      <w:r>
+        <w:t xml:space="preserve"> using </w:t>
+      </w:r>
+      <w:proofErr w:type="spellStart"/>
+      <w:r>
+        <w:t>primary_game_id</w:t>
+      </w:r>
+      <w:proofErr w:type="spellEnd"/>
       <w:r>
         <w:t>.</w:t>
       </w:r>
@@ -393,7 +478,15 @@
         <w:t>I also used it to validate totals after creating pivots on the excel files.</w:t>
       </w:r>
       <w:r>
-        <w:t xml:space="preserve"> Also helped with creating a git repo (have only used others).</w:t>
+        <w:t xml:space="preserve"> Also helped with creating a </w:t>
+      </w:r>
+      <w:proofErr w:type="spellStart"/>
+      <w:r>
+        <w:t>git</w:t>
+      </w:r>
+      <w:proofErr w:type="spellEnd"/>
+      <w:r>
+        <w:t xml:space="preserve"> repo (have only used others).</w:t>
       </w:r>
     </w:p>
     <w:p>
@@ -442,6 +535,27 @@
     <w:p>
       <w:r>
         <w:t>Set up a GitHub repo at the start.</w:t>
+      </w:r>
+    </w:p>
+    <w:p/>
+    <w:p>
+      <w:pPr>
+        <w:rPr>
+          <w:b/>
+          <w:bCs/>
+        </w:rPr>
+      </w:pPr>
+      <w:r>
+        <w:rPr>
+          <w:b/>
+          <w:bCs/>
+        </w:rPr>
+        <w:t>APPROXIMATE TIME TAKEN FROM START TO GIT UPLOAD</w:t>
+      </w:r>
+    </w:p>
+    <w:p>
+      <w:r>
+        <w:t>4 hours 50 minutes</w:t>
       </w:r>
     </w:p>
     <w:sectPr>

</xml_diff>

<commit_message>
Add requirements.txt and add a few lines to project_notes.docx
</commit_message>
<xml_diff>
--- a/project_notes.docx
+++ b/project_notes.docx
@@ -373,6 +373,9 @@
         <w:t xml:space="preserve"> are treated as duplicate records and counted once</w:t>
       </w:r>
       <w:r>
+        <w:t xml:space="preserve"> (earliest record)</w:t>
+      </w:r>
+      <w:r>
         <w:t>.</w:t>
       </w:r>
     </w:p>
@@ -400,6 +403,9 @@
       </w:r>
       <w:proofErr w:type="spellEnd"/>
       <w:r>
+        <w:t xml:space="preserve"> (see “if I had more time” below)</w:t>
+      </w:r>
+      <w:r>
         <w:t>.</w:t>
       </w:r>
     </w:p>
@@ -411,7 +417,7 @@
         <w:t xml:space="preserve"> (settlements = positive, reversals = negative)</w:t>
       </w:r>
       <w:r>
-        <w:t xml:space="preserve">. Assumed these are the only statuses and there are no cancellations or </w:t>
+        <w:t xml:space="preserve">. Assumed these are the only statuses and there are no </w:t>
       </w:r>
       <w:r>
         <w:t>expirations</w:t>
@@ -457,7 +463,13 @@
         <w:t>generate SQL code for staging tables</w:t>
       </w:r>
       <w:r>
-        <w:t>, explain what outstanding float meant</w:t>
+        <w:t>,</w:t>
+      </w:r>
+      <w:r>
+        <w:t xml:space="preserve"> generate code for ERD image,</w:t>
+      </w:r>
+      <w:r>
+        <w:t xml:space="preserve"> explain what outstanding float meant</w:t>
       </w:r>
       <w:r>
         <w:t xml:space="preserve">, </w:t>
@@ -486,7 +498,13 @@
       </w:r>
       <w:proofErr w:type="spellEnd"/>
       <w:r>
-        <w:t xml:space="preserve"> repo (have only used others).</w:t>
+        <w:t xml:space="preserve"> repo (have </w:t>
+      </w:r>
+      <w:r>
+        <w:t>not created one before</w:t>
+      </w:r>
+      <w:r>
+        <w:t>).</w:t>
       </w:r>
     </w:p>
     <w:p>
@@ -514,7 +532,15 @@
     </w:p>
     <w:p>
       <w:r>
-        <w:t>Take a breath and try to be less nervous.</w:t>
+        <w:t>Take a breath</w:t>
+      </w:r>
+      <w:r>
+        <w:t>.</w:t>
+      </w:r>
+    </w:p>
+    <w:p>
+      <w:r>
+        <w:t>Manage and track time better.</w:t>
       </w:r>
     </w:p>
     <w:p>
@@ -529,12 +555,34 @@
     </w:p>
     <w:p>
       <w:r>
-        <w:t>Make the Excel report prettier – add slicers and organize it better. Add additional things that might be interesting to stakeholders and group by different fields, etc.</w:t>
-      </w:r>
-    </w:p>
-    <w:p>
-      <w:r>
-        <w:t>Set up a GitHub repo at the start.</w:t>
+        <w:t xml:space="preserve">Spend more time digging into earned events vs redeemed events vs </w:t>
+      </w:r>
+      <w:proofErr w:type="spellStart"/>
+      <w:r>
+        <w:t>game_id</w:t>
+      </w:r>
+      <w:proofErr w:type="spellEnd"/>
+      <w:r>
+        <w:t xml:space="preserve"> to see if I can correctly identify the actual </w:t>
+      </w:r>
+      <w:proofErr w:type="spellStart"/>
+      <w:r>
+        <w:t>game_id</w:t>
+      </w:r>
+      <w:proofErr w:type="spellEnd"/>
+      <w:r>
+        <w:t xml:space="preserve"> for each redemption.</w:t>
+      </w:r>
+    </w:p>
+    <w:p>
+      <w:r>
+        <w:t>Make the Excel report prettier – add slicers and organize it better. Add additional things that might be interesting</w:t>
+      </w:r>
+      <w:r>
+        <w:t>/important</w:t>
+      </w:r>
+      <w:r>
+        <w:t xml:space="preserve"> to stakeholders and group by different fields, etc.</w:t>
       </w:r>
     </w:p>
     <w:p/>
@@ -550,6 +598,7 @@
           <w:b/>
           <w:bCs/>
         </w:rPr>
+        <w:lastRenderedPageBreak/>
         <w:t>APPROXIMATE TIME TAKEN FROM START TO GIT UPLOAD</w:t>
       </w:r>
     </w:p>

</xml_diff>